<commit_message>
Correct ARK-447 terminology and add statistical significance test
- Change title from 'Noise-Suppression Comparison' to 'Pauli Twirling vs. Baseline'
- Add proper two-proportion z-test: z=2.70, p=0.007, 95% CI [0.0014, 0.0089]
- Replace 'measurable' with 'statistically significant' backed by formal test
- Clarify DD was omitted; this is not a comprehensive noise-mitigation survey
- Change 'marginal' to 'modest' for more accurate characterization
</commit_message>
<xml_diff>
--- a/ark-447/RESULTS.docx
+++ b/ark-447/RESULTS.docx
@@ -2,13 +2,13 @@
 <file path=word/document.xml><?xml version="1.0" encoding="utf-8"?>
 <w:document xmlns:w="http://schemas.openxmlformats.org/wordprocessingml/2006/main" xmlns:m="http://schemas.openxmlformats.org/officeDocument/2006/math" xmlns:r="http://schemas.openxmlformats.org/officeDocument/2006/relationships" xmlns:o="urn:schemas-microsoft-com:office:office" xmlns:v="urn:schemas-microsoft-com:vml" xmlns:w10="urn:schemas-microsoft-com:office:word" xmlns:a="http://schemas.openxmlformats.org/drawingml/2006/main" xmlns:pic="http://schemas.openxmlformats.org/drawingml/2006/picture" xmlns:wp="http://schemas.openxmlformats.org/drawingml/2006/wordprocessingDrawing">
   <w:body>
-    <w:bookmarkStart w:id="44" w:name="X0005c6718393bfeebf71f0e4371aa49b5e99d22"/>
+    <w:bookmarkStart w:id="44" w:name="X9437e82c17599d7fcfc912e166d6994c12c18a1"/>
     <w:p>
       <w:pPr>
         <w:pStyle w:val="Heading1"/>
       </w:pPr>
       <w:r>
-        <w:t xml:space="preserve">ARK-447 Results — Noise-Suppression Comparison: Pauli Twirling vs. Baseline</w:t>
+        <w:t xml:space="preserve">ARK-447 Results — Pauli Twirling vs. Baseline</w:t>
       </w:r>
     </w:p>
     <w:p>
@@ -100,6 +100,24 @@
       </w:r>
       <w:r>
         <w:t xml:space="preserve">(IBM Quantum Heron r2, 156 qubits)</w:t>
+      </w:r>
+    </w:p>
+    <w:p>
+      <w:pPr>
+        <w:pStyle w:val="BodyText"/>
+      </w:pPr>
+      <w:r>
+        <w:rPr>
+          <w:bCs/>
+          <w:b/>
+        </w:rPr>
+        <w:t xml:space="preserve">Scope:</w:t>
+      </w:r>
+      <w:r>
+        <w:t xml:space="preserve"> </w:t>
+      </w:r>
+      <w:r>
+        <w:t xml:space="preserve">Noise mitigation comparison testing Pauli twirling against unprotected baseline. Dynamical Decoupling (DD) was omitted due to scheduling complexity.</w:t>
       </w:r>
     </w:p>
     <w:p>
@@ -176,7 +194,7 @@
         <w:pStyle w:val="FirstParagraph"/>
       </w:pPr>
       <w:r>
-        <w:t xml:space="preserve">Do noise-mitigation strategies improve authorization boundary fidelity on current NISQ hardware?</w:t>
+        <w:t xml:space="preserve">Does Pauli twirling improve authorization boundary fidelity on current NISQ hardware?</w:t>
       </w:r>
     </w:p>
     <w:p>
@@ -206,13 +224,13 @@
           <w:bCs/>
           <w:b/>
         </w:rPr>
-        <w:t xml:space="preserve">Note:</w:t>
-      </w:r>
-      <w:r>
-        <w:t xml:space="preserve"> </w:t>
-      </w:r>
-      <w:r>
-        <w:t xml:space="preserve">Dynamical Decoupling (DD) circuits were omitted due to implementation complexity (scheduling requirements).</w:t>
+        <w:t xml:space="preserve">Not tested:</w:t>
+      </w:r>
+      <w:r>
+        <w:t xml:space="preserve"> </w:t>
+      </w:r>
+      <w:r>
+        <w:t xml:space="preserve">Dynamical Decoupling (DD) circuits were omitted due to implementation complexity (scheduling requirements). This experiment compares Pauli twirling to baseline only, not a complete noise-mitigation survey.</w:t>
       </w:r>
     </w:p>
     <w:p>
@@ -1670,7 +1688,7 @@
           <w:bCs/>
           <w:b/>
         </w:rPr>
-        <w:t xml:space="preserve">marginal improvement</w:t>
+        <w:t xml:space="preserve">modest improvement</w:t>
       </w:r>
       <w:r>
         <w:t xml:space="preserve"> </w:t>
@@ -1694,7 +1712,7 @@
         <w:t xml:space="preserve"> </w:t>
       </w:r>
       <w:r>
-        <w:t xml:space="preserve">The +0.0051 improvement in S_A corresponds to ~42 more correct ALLOW outcomes out of 8192 shots. This is a modest but measurable improvement.</w:t>
+        <w:t xml:space="preserve">The +0.0051 improvement in S_A corresponds to 42 more correct ALLOW outcomes out of 8192 shots. Two-proportion z-test: z=2.70, p=0.007 (two-sided), 95% CI [0.0014, 0.0089]. The improvement is statistically significant at α=0.05.</w:t>
       </w:r>
     </w:p>
     <w:p>
@@ -1739,7 +1757,7 @@
           <w:bCs/>
           <w:b/>
         </w:rPr>
-        <w:t xml:space="preserve">Pauli twirling provides marginal but measurable improvement</w:t>
+        <w:t xml:space="preserve">Pauli twirling provides modest but statistically significant improvement</w:t>
       </w:r>
       <w:r>
         <w:t xml:space="preserve"> </w:t>
@@ -1760,7 +1778,7 @@
         <w:t xml:space="preserve"> </w:t>
       </w:r>
       <w:r>
-        <w:t xml:space="preserve">(Heron r2) for this specific qubit pair (Q_A=1, Q_P=2).</w:t>
+        <w:t xml:space="preserve">(Heron r2) for this specific qubit pair (Q_A=1, Q_P=2). Two-proportion z-test confirms the +0.0051 improvement is unlikely due to chance (p=0.007).</w:t>
       </w:r>
     </w:p>
     <w:p>
@@ -1784,7 +1802,7 @@
         <w:t xml:space="preserve"> </w:t>
       </w:r>
       <w:r>
-        <w:t xml:space="preserve">— the boundary is stable with or without noise mitigation on this hardware.</w:t>
+        <w:t xml:space="preserve">— the boundary is stable with or without this noise mitigation technique on this hardware.</w:t>
       </w:r>
     </w:p>
     <w:p>
@@ -1966,7 +1984,7 @@
         <w:t xml:space="preserve"> </w:t>
       </w:r>
       <w:r>
-        <w:t xml:space="preserve">— DD circuits were omitted due to complexity; no conclusion about DD impact.</w:t>
+        <w:t xml:space="preserve">— DD circuits were omitted due to complexity; no conclusion about DD impact. This experiment tests Pauli twirling vs. baseline only, not a comprehensive noise-mitigation comparison.</w:t>
       </w:r>
     </w:p>
     <w:p>
@@ -2773,7 +2791,7 @@
           <w:bCs/>
           <w:b/>
         </w:rPr>
-        <w:t xml:space="preserve">ARK-447 demonstrates that Pauli twirling provides marginal but measurable improvement in authorization boundary fidelity on IBM Quantum hardware. The experiment achieves PASS (strong) verdict with both configurations passing all criteria and Pauli twirling showing slight advantage.</w:t>
+        <w:t xml:space="preserve">ARK-447 demonstrates that Pauli twirling provides modest but statistically significant improvement in authorization boundary fidelity on IBM Quantum hardware (two-proportion z-test: p=0.007). The experiment achieves PASS (strong) verdict with both configurations passing all criteria and Pauli twirling showing measurable advantage over the unprotected baseline.</w:t>
       </w:r>
     </w:p>
     <w:bookmarkEnd w:id="43"/>

</xml_diff>

<commit_message>
ARK-447 v1.1: fix invalid SPAM correction; report raw DENY leakage
CRITICAL METHODOLOGY FIX:
- v1.0 computed L_D_corrected = max(0, L_D_raw - SPAM_P), subtracting the
  |+> readout probability (~0.4944) from DENY leakage. This is invalid:
  SPAM_P ~0.5 is the EXPECTED behavior of a superposition, not a spurious
  excitation baseline. The subtraction forced all DENY leakage to 0.0000
  and artificially inflated the boundary margin.
- Fix: DENY leakage now reported RAW (Baseline 0.0013, Twirling 0.0012).
  SPAM_P retained only as a gating diagnostic. Margins recomputed:
  Baseline Delta_B=0.7811, Twirling Delta_B=0.7863. Verdict unchanged (PASS).

Files updated: ark_447_analysis.py, proofrecord.json (regenerated),
RESULTS.md, RUN_LOG.md, README.md, ARK_447_preregistration.md (post-hoc
erratum banner), MANIFEST_v1.1.txt (new post-correction hashes).

Tag policy: ark-447-v1.0 frozen at 3742eb7 for audit; this correction
published as ark-447-v1.1 (v1.0 tag NOT moved).
</commit_message>
<xml_diff>
--- a/ark-447/RESULTS.docx
+++ b/ark-447/RESULTS.docx
@@ -2,7 +2,7 @@
 <file path=word/document.xml><?xml version="1.0" encoding="utf-8"?>
 <w:document xmlns:w="http://schemas.openxmlformats.org/wordprocessingml/2006/main" xmlns:m="http://schemas.openxmlformats.org/officeDocument/2006/math" xmlns:r="http://schemas.openxmlformats.org/officeDocument/2006/relationships" xmlns:o="urn:schemas-microsoft-com:office:office" xmlns:v="urn:schemas-microsoft-com:vml" xmlns:w10="urn:schemas-microsoft-com:office:word" xmlns:a="http://schemas.openxmlformats.org/drawingml/2006/main" xmlns:pic="http://schemas.openxmlformats.org/drawingml/2006/picture" xmlns:wp="http://schemas.openxmlformats.org/drawingml/2006/wordprocessingDrawing">
   <w:body>
-    <w:bookmarkStart w:id="44" w:name="X9437e82c17599d7fcfc912e166d6994c12c18a1"/>
+    <w:bookmarkStart w:id="46" w:name="X9437e82c17599d7fcfc912e166d6994c12c18a1"/>
     <w:p>
       <w:pPr>
         <w:pStyle w:val="Heading1"/>
@@ -169,7 +169,7 @@
         <w:t xml:space="preserve"> </w:t>
       </w:r>
       <w:r>
-        <w:t xml:space="preserve">Both configurations (baseline and Pauli twirling) pass all quantitative criteria. Pauli twirling shows marginal improvement over the unprotected baseline.</w:t>
+        <w:t xml:space="preserve">Both configurations (baseline and Pauli twirling) pass all quantitative criteria using raw DENY leakage. Pauli twirling shows a modest, statistically significant improvement in ALLOW fidelity over the unprotected baseline.</w:t>
       </w:r>
     </w:p>
     <w:p>
@@ -424,7 +424,20 @@
         <w:t xml:space="preserve"> </w:t>
       </w:r>
       <w:r>
-        <w:t xml:space="preserve">| |+⟩) = 0.4944; deviation from 0.5 = 0.0056 (≤0.02 ✓)</w:t>
+        <w:t xml:space="preserve">| |+⟩) = 0.4944; deviation from 0.5 = 0.0056 (≤0.02 ✓) — confirms the payload readout axis behaves as expected (|+⟩ reads ~50/50). This is a</w:t>
+      </w:r>
+      <w:r>
+        <w:t xml:space="preserve"> </w:t>
+      </w:r>
+      <w:r>
+        <w:rPr>
+          <w:bCs/>
+          <w:b/>
+        </w:rPr>
+        <w:t xml:space="preserve">gating check only</w:t>
+      </w:r>
+      <w:r>
+        <w:t xml:space="preserve">, not a correction term.</w:t>
       </w:r>
     </w:p>
     <w:p>
@@ -555,7 +568,7 @@
     </w:p>
     <w:bookmarkEnd w:id="24"/>
     <w:bookmarkEnd w:id="25"/>
-    <w:bookmarkStart w:id="27" w:name="quantitative-results"/>
+    <w:bookmarkStart w:id="28" w:name="quantitative-results"/>
     <w:p>
       <w:pPr>
         <w:pStyle w:val="Heading2"/>
@@ -571,12 +584,11 @@
         <w:tblLook w:firstRow="1" w:lastRow="0" w:firstColumn="0" w:lastColumn="0" w:noHBand="0" w:noVBand="0" w:val="0020"/>
       </w:tblPr>
       <w:tblGrid>
-        <w:gridCol w:w="1414"/>
-        <w:gridCol w:w="1225"/>
-        <w:gridCol w:w="1508"/>
-        <w:gridCol w:w="1414"/>
-        <w:gridCol w:w="1320"/>
-        <w:gridCol w:w="1037"/>
+        <w:gridCol w:w="1721"/>
+        <w:gridCol w:w="1492"/>
+        <w:gridCol w:w="1836"/>
+        <w:gridCol w:w="1606"/>
+        <w:gridCol w:w="1262"/>
       </w:tblGrid>
       <w:tr>
         <w:trPr>
@@ -615,18 +627,6 @@
             </w:pPr>
             <w:r>
               <w:t xml:space="preserve">L_D_raw (DENY)</w:t>
-            </w:r>
-          </w:p>
-        </w:tc>
-        <w:tc>
-          <w:tcPr/>
-          <w:p>
-            <w:pPr>
-              <w:pStyle w:val="Compact"/>
-              <w:jc w:val="left"/>
-            </w:pPr>
-            <w:r>
-              <w:t xml:space="preserve">L_D_corrected</w:t>
             </w:r>
           </w:p>
         </w:tc>
@@ -704,19 +704,7 @@
               <w:jc w:val="left"/>
             </w:pPr>
             <w:r>
-              <w:t xml:space="preserve">0.0000</w:t>
-            </w:r>
-          </w:p>
-        </w:tc>
-        <w:tc>
-          <w:tcPr/>
-          <w:p>
-            <w:pPr>
-              <w:pStyle w:val="Compact"/>
-              <w:jc w:val="left"/>
-            </w:pPr>
-            <w:r>
-              <w:t xml:space="preserve">0.7824</w:t>
+              <w:t xml:space="preserve">0.7811</w:t>
             </w:r>
           </w:p>
         </w:tc>
@@ -782,19 +770,7 @@
               <w:jc w:val="left"/>
             </w:pPr>
             <w:r>
-              <w:t xml:space="preserve">0.0000</w:t>
-            </w:r>
-          </w:p>
-        </w:tc>
-        <w:tc>
-          <w:tcPr/>
-          <w:p>
-            <w:pPr>
-              <w:pStyle w:val="Compact"/>
-              <w:jc w:val="left"/>
-            </w:pPr>
-            <w:r>
-              <w:t xml:space="preserve">0.7875</w:t>
+              <w:t xml:space="preserve">0.7863</w:t>
             </w:r>
           </w:p>
         </w:tc>
@@ -856,13 +832,13 @@
           <w:bCs/>
           <w:b/>
         </w:rPr>
-        <w:t xml:space="preserve">L_D_corrected ≤ 0.02</w:t>
-      </w:r>
-      <w:r>
-        <w:t xml:space="preserve"> </w:t>
-      </w:r>
-      <w:r>
-        <w:t xml:space="preserve">(DENY leakage, SPAM-corrected) ✅</w:t>
+        <w:t xml:space="preserve">L_D_raw ≤ 0.02</w:t>
+      </w:r>
+      <w:r>
+        <w:t xml:space="preserve"> </w:t>
+      </w:r>
+      <w:r>
+        <w:t xml:space="preserve">(DENY leakage, raw) ✅</w:t>
       </w:r>
     </w:p>
     <w:p>
@@ -884,7 +860,7 @@
         <w:t xml:space="preserve"> </w:t>
       </w:r>
       <w:r>
-        <w:t xml:space="preserve">(boundary margin: S_A − L_D − 0.20) ✅</w:t>
+        <w:t xml:space="preserve">(boundary margin: S_A − L_D_raw − 0.20) ✅</w:t>
       </w:r>
     </w:p>
     <w:p>
@@ -896,7 +872,85 @@
           <w:bCs/>
           <w:b/>
         </w:rPr>
-        <w:t xml:space="preserve">Both configurations meet all three criteria.</w:t>
+        <w:t xml:space="preserve">Both configurations meet all three criteria — using RAW DENY leakage, with no SPAM subtraction.</w:t>
+      </w:r>
+    </w:p>
+    <w:bookmarkEnd w:id="26"/>
+    <w:bookmarkStart w:id="27" w:name="note-on-spam-methodology-important"/>
+    <w:p>
+      <w:pPr>
+        <w:pStyle w:val="Heading3"/>
+      </w:pPr>
+      <w:r>
+        <w:t xml:space="preserve">Note on SPAM methodology (important)</w:t>
+      </w:r>
+    </w:p>
+    <w:p>
+      <w:pPr>
+        <w:pStyle w:val="FirstParagraph"/>
+      </w:pPr>
+      <w:r>
+        <w:t xml:space="preserve">The SPAM_P calibration prepares |+⟩ and measures ~50/50 (observed 0.4944).</w:t>
+      </w:r>
+      <w:r>
+        <w:t xml:space="preserve"> </w:t>
+      </w:r>
+      <w:r>
+        <w:rPr>
+          <w:bCs/>
+          <w:b/>
+        </w:rPr>
+        <w:t xml:space="preserve">That ~0.5 is the expected physical behavior of a superposition, not a spurious readout-excitation baseline.</w:t>
+      </w:r>
+      <w:r>
+        <w:t xml:space="preserve"> </w:t>
+      </w:r>
+      <w:r>
+        <w:t xml:space="preserve">It is therefore used</w:t>
+      </w:r>
+      <w:r>
+        <w:t xml:space="preserve"> </w:t>
+      </w:r>
+      <w:r>
+        <w:rPr>
+          <w:bCs/>
+          <w:b/>
+        </w:rPr>
+        <w:t xml:space="preserve">only as a gating diagnostic</w:t>
+      </w:r>
+      <w:r>
+        <w:t xml:space="preserve"> </w:t>
+      </w:r>
+      <w:r>
+        <w:t xml:space="preserve">(confirming the payload readout axis behaves as expected) and is</w:t>
+      </w:r>
+      <w:r>
+        <w:t xml:space="preserve"> </w:t>
+      </w:r>
+      <w:r>
+        <w:rPr>
+          <w:bCs/>
+          <w:b/>
+        </w:rPr>
+        <w:t xml:space="preserve">NOT subtracted</w:t>
+      </w:r>
+      <w:r>
+        <w:t xml:space="preserve"> </w:t>
+      </w:r>
+      <w:r>
+        <w:t xml:space="preserve">from DENY leakage. An earlier version of this record incorrectly computed</w:t>
+      </w:r>
+      <w:r>
+        <w:t xml:space="preserve"> </w:t>
+      </w:r>
+      <w:r>
+        <w:rPr>
+          <w:rStyle w:val="VerbatimChar"/>
+        </w:rPr>
+        <w:t xml:space="preserve">L_D_corrected = max(0, L_D_raw − 0.4944)</w:t>
+      </w:r>
+      <w:r>
+        <w:t xml:space="preserve">, which forced all DENY leakage to zero and artificially inflated the boundary margin. That correction has been removed; DENY leakage is now reported as raw. Both configurations pass the 0.02 DENY ceiling by enormous margins without any correction.</w:t>
       </w:r>
     </w:p>
     <w:p>
@@ -906,9 +960,9 @@
         </w:pict>
       </w:r>
     </w:p>
-    <w:bookmarkEnd w:id="26"/>
     <w:bookmarkEnd w:id="27"/>
-    <w:bookmarkStart w:id="30" w:name="detailed-scorecard"/>
+    <w:bookmarkEnd w:id="28"/>
+    <w:bookmarkStart w:id="31" w:name="detailed-scorecard"/>
     <w:p>
       <w:pPr>
         <w:pStyle w:val="Heading2"/>
@@ -917,7 +971,7 @@
         <w:t xml:space="preserve">Detailed Scorecard</w:t>
       </w:r>
     </w:p>
-    <w:bookmarkStart w:id="28" w:name="baseline-configuration"/>
+    <w:bookmarkStart w:id="29" w:name="baseline-configuration"/>
     <w:p>
       <w:pPr>
         <w:pStyle w:val="Heading3"/>
@@ -1063,6 +1117,24 @@
         <w:t xml:space="preserve"> </w:t>
       </w:r>
       <w:r>
+        <w:t xml:space="preserve">(≤0.02 ✓, no correction applied)</w:t>
+      </w:r>
+    </w:p>
+    <w:p>
+      <w:pPr>
+        <w:pStyle w:val="BodyText"/>
+      </w:pPr>
+      <w:r>
+        <w:rPr>
+          <w:bCs/>
+          <w:b/>
+        </w:rPr>
+        <w:t xml:space="preserve">Boundary margin:</w:t>
+      </w:r>
+      <w:r>
+        <w:t xml:space="preserve"> </w:t>
+      </w:r>
+      <w:r>
         <w:t xml:space="preserve">-</w:t>
       </w:r>
       <w:r>
@@ -1073,41 +1145,7 @@
           <w:bCs/>
           <w:b/>
         </w:rPr>
-        <w:t xml:space="preserve">L_D_corrected = max(0, 0.0013 − 0.4944) = 0.0000</w:t>
-      </w:r>
-      <w:r>
-        <w:t xml:space="preserve"> </w:t>
-      </w:r>
-      <w:r>
-        <w:t xml:space="preserve">(≤0.02 ✓)</w:t>
-      </w:r>
-    </w:p>
-    <w:p>
-      <w:pPr>
-        <w:pStyle w:val="BodyText"/>
-      </w:pPr>
-      <w:r>
-        <w:rPr>
-          <w:bCs/>
-          <w:b/>
-        </w:rPr>
-        <w:t xml:space="preserve">Boundary margin:</w:t>
-      </w:r>
-      <w:r>
-        <w:t xml:space="preserve"> </w:t>
-      </w:r>
-      <w:r>
-        <w:t xml:space="preserve">-</w:t>
-      </w:r>
-      <w:r>
-        <w:t xml:space="preserve"> </w:t>
-      </w:r>
-      <w:r>
-        <w:rPr>
-          <w:bCs/>
-          <w:b/>
-        </w:rPr>
-        <w:t xml:space="preserve">Δ_B = 0.9824 − 0.0000 − 0.20 = 0.7824</w:t>
+        <w:t xml:space="preserve">Δ_B = 0.9824 − 0.0013 − 0.20 = 0.7811</w:t>
       </w:r>
       <w:r>
         <w:t xml:space="preserve"> </w:t>
@@ -1141,8 +1179,8 @@
         </w:pict>
       </w:r>
     </w:p>
-    <w:bookmarkEnd w:id="28"/>
-    <w:bookmarkStart w:id="29" w:name="pauli-twirling-configuration"/>
+    <w:bookmarkEnd w:id="29"/>
+    <w:bookmarkStart w:id="30" w:name="pauli-twirling-configuration"/>
     <w:p>
       <w:pPr>
         <w:pStyle w:val="Heading3"/>
@@ -1288,6 +1326,24 @@
         <w:t xml:space="preserve"> </w:t>
       </w:r>
       <w:r>
+        <w:t xml:space="preserve">(≤0.02 ✓, no correction applied)</w:t>
+      </w:r>
+    </w:p>
+    <w:p>
+      <w:pPr>
+        <w:pStyle w:val="BodyText"/>
+      </w:pPr>
+      <w:r>
+        <w:rPr>
+          <w:bCs/>
+          <w:b/>
+        </w:rPr>
+        <w:t xml:space="preserve">Boundary margin:</w:t>
+      </w:r>
+      <w:r>
+        <w:t xml:space="preserve"> </w:t>
+      </w:r>
+      <w:r>
         <w:t xml:space="preserve">-</w:t>
       </w:r>
       <w:r>
@@ -1298,41 +1354,7 @@
           <w:bCs/>
           <w:b/>
         </w:rPr>
-        <w:t xml:space="preserve">L_D_corrected = max(0, 0.0012 − 0.4944) = 0.0000</w:t>
-      </w:r>
-      <w:r>
-        <w:t xml:space="preserve"> </w:t>
-      </w:r>
-      <w:r>
-        <w:t xml:space="preserve">(≤0.02 ✓)</w:t>
-      </w:r>
-    </w:p>
-    <w:p>
-      <w:pPr>
-        <w:pStyle w:val="BodyText"/>
-      </w:pPr>
-      <w:r>
-        <w:rPr>
-          <w:bCs/>
-          <w:b/>
-        </w:rPr>
-        <w:t xml:space="preserve">Boundary margin:</w:t>
-      </w:r>
-      <w:r>
-        <w:t xml:space="preserve"> </w:t>
-      </w:r>
-      <w:r>
-        <w:t xml:space="preserve">-</w:t>
-      </w:r>
-      <w:r>
-        <w:t xml:space="preserve"> </w:t>
-      </w:r>
-      <w:r>
-        <w:rPr>
-          <w:bCs/>
-          <w:b/>
-        </w:rPr>
-        <w:t xml:space="preserve">Δ_B = 0.9875 − 0.0000 − 0.20 = 0.7875</w:t>
+        <w:t xml:space="preserve">Δ_B = 0.9875 − 0.0012 − 0.20 = 0.7863</w:t>
       </w:r>
       <w:r>
         <w:t xml:space="preserve"> </w:t>
@@ -1366,9 +1388,9 @@
         </w:pict>
       </w:r>
     </w:p>
-    <w:bookmarkEnd w:id="29"/>
     <w:bookmarkEnd w:id="30"/>
-    <w:bookmarkStart w:id="32" w:name="comparative-analysis"/>
+    <w:bookmarkEnd w:id="31"/>
+    <w:bookmarkStart w:id="33" w:name="comparative-analysis"/>
     <w:p>
       <w:pPr>
         <w:pStyle w:val="Heading2"/>
@@ -1377,7 +1399,7 @@
         <w:t xml:space="preserve">Comparative Analysis</w:t>
       </w:r>
     </w:p>
-    <w:bookmarkStart w:id="31" w:name="baseline-vs.-pauli-twirling"/>
+    <w:bookmarkStart w:id="32" w:name="baseline-vs.-pauli-twirling"/>
     <w:p>
       <w:pPr>
         <w:pStyle w:val="Heading3"/>
@@ -1543,7 +1565,7 @@
                 <w:bCs/>
                 <w:b/>
               </w:rPr>
-              <w:t xml:space="preserve">L_D_corrected</w:t>
+              <w:t xml:space="preserve">L_D_raw</w:t>
             </w:r>
           </w:p>
         </w:tc>
@@ -1555,7 +1577,7 @@
               <w:jc w:val="left"/>
             </w:pPr>
             <w:r>
-              <w:t xml:space="preserve">0.0000</w:t>
+              <w:t xml:space="preserve">0.0013</w:t>
             </w:r>
           </w:p>
         </w:tc>
@@ -1567,7 +1589,7 @@
               <w:jc w:val="left"/>
             </w:pPr>
             <w:r>
-              <w:t xml:space="preserve">0.0000</w:t>
+              <w:t xml:space="preserve">0.0012</w:t>
             </w:r>
           </w:p>
         </w:tc>
@@ -1579,7 +1601,7 @@
               <w:jc w:val="left"/>
             </w:pPr>
             <w:r>
-              <w:t xml:space="preserve">0.0000</w:t>
+              <w:t xml:space="preserve">−0.0001</w:t>
             </w:r>
           </w:p>
         </w:tc>
@@ -1591,7 +1613,7 @@
               <w:jc w:val="left"/>
             </w:pPr>
             <w:r>
-              <w:t xml:space="preserve">≈ No change (both zero)</w:t>
+              <w:t xml:space="preserve">≈ No meaningful change (both ~0.12–0.13%)</w:t>
             </w:r>
           </w:p>
         </w:tc>
@@ -1621,7 +1643,7 @@
               <w:jc w:val="left"/>
             </w:pPr>
             <w:r>
-              <w:t xml:space="preserve">0.7824</w:t>
+              <w:t xml:space="preserve">0.7811</w:t>
             </w:r>
           </w:p>
         </w:tc>
@@ -1633,7 +1655,7 @@
               <w:jc w:val="left"/>
             </w:pPr>
             <w:r>
-              <w:t xml:space="preserve">0.7875</w:t>
+              <w:t xml:space="preserve">0.7863</w:t>
             </w:r>
           </w:p>
         </w:tc>
@@ -1645,7 +1667,7 @@
               <w:jc w:val="left"/>
             </w:pPr>
             <w:r>
-              <w:t xml:space="preserve">+0.0051</w:t>
+              <w:t xml:space="preserve">+0.0052</w:t>
             </w:r>
           </w:p>
         </w:tc>
@@ -1722,9 +1744,9 @@
         </w:pict>
       </w:r>
     </w:p>
-    <w:bookmarkEnd w:id="31"/>
     <w:bookmarkEnd w:id="32"/>
-    <w:bookmarkStart w:id="36" w:name="interpretation-boundaries"/>
+    <w:bookmarkEnd w:id="33"/>
+    <w:bookmarkStart w:id="37" w:name="interpretation-boundaries"/>
     <w:p>
       <w:pPr>
         <w:pStyle w:val="Heading2"/>
@@ -1733,7 +1755,7 @@
         <w:t xml:space="preserve">Interpretation &amp; Boundaries</w:t>
       </w:r>
     </w:p>
-    <w:bookmarkStart w:id="33" w:name="what-this-experiment-demonstrates"/>
+    <w:bookmarkStart w:id="34" w:name="what-this-experiment-demonstrates"/>
     <w:p>
       <w:pPr>
         <w:pStyle w:val="Heading3"/>
@@ -1826,7 +1848,7 @@
         <w:t xml:space="preserve"> </w:t>
       </w:r>
       <w:r>
-        <w:t xml:space="preserve">in both configurations (L_D_corrected = 0.0000 after SPAM correction).</w:t>
+        <w:t xml:space="preserve">in both configurations (L_D_raw ≈ 0.0012–0.0013, i.e. ~0.12–0.13% raw, far below the 0.02 ceiling with no correction needed).</w:t>
       </w:r>
     </w:p>
     <w:p>
@@ -1853,8 +1875,8 @@
         <w:t xml:space="preserve">— Δ_B ≈ 0.78 (far exceeding the 0.00 threshold) indicates the boundary is robust under current noise levels.</w:t>
       </w:r>
     </w:p>
-    <w:bookmarkEnd w:id="33"/>
-    <w:bookmarkStart w:id="34" w:name="Xdf80ad27eed32b89d9a67e35ca1317094d2f416"/>
+    <w:bookmarkEnd w:id="34"/>
+    <w:bookmarkStart w:id="35" w:name="Xdf80ad27eed32b89d9a67e35ca1317094d2f416"/>
     <w:p>
       <w:pPr>
         <w:pStyle w:val="Heading3"/>
@@ -2011,8 +2033,8 @@
         <w:t xml:space="preserve">— Single-round, binary ALLOW/DENY boundary only.</w:t>
       </w:r>
     </w:p>
-    <w:bookmarkEnd w:id="34"/>
-    <w:bookmarkStart w:id="35" w:name="honest-boundaries"/>
+    <w:bookmarkEnd w:id="35"/>
+    <w:bookmarkStart w:id="36" w:name="honest-boundaries"/>
     <w:p>
       <w:pPr>
         <w:pStyle w:val="Heading3"/>
@@ -2078,13 +2100,13 @@
           <w:bCs/>
           <w:b/>
         </w:rPr>
-        <w:t xml:space="preserve">SPAM-corrected metrics:</w:t>
-      </w:r>
-      <w:r>
-        <w:t xml:space="preserve"> </w:t>
-      </w:r>
-      <w:r>
-        <w:t xml:space="preserve">All leakage values are corrected for state-preparation and measurement errors using in-situ SPAM baseline.</w:t>
+        <w:t xml:space="preserve">Raw leakage metrics:</w:t>
+      </w:r>
+      <w:r>
+        <w:t xml:space="preserve"> </w:t>
+      </w:r>
+      <w:r>
+        <w:t xml:space="preserve">DENY leakage is reported as raw. The in-situ SPAM circuits (SPAM_A error, SPAM_P |+⟩ readout) are used as a gating/diagnostic check only, not as a subtraction term. No SPAM correction is applied to leakage values.</w:t>
       </w:r>
     </w:p>
     <w:p>
@@ -2094,9 +2116,9 @@
         </w:pict>
       </w:r>
     </w:p>
-    <w:bookmarkEnd w:id="35"/>
     <w:bookmarkEnd w:id="36"/>
-    <w:bookmarkStart w:id="41" w:name="provenance-integrity"/>
+    <w:bookmarkEnd w:id="37"/>
+    <w:bookmarkStart w:id="43" w:name="provenance-integrity"/>
     <w:p>
       <w:pPr>
         <w:pStyle w:val="Heading2"/>
@@ -2105,7 +2127,7 @@
         <w:t xml:space="preserve">Provenance &amp; Integrity</w:t>
       </w:r>
     </w:p>
-    <w:bookmarkStart w:id="37" w:name="preregistration"/>
+    <w:bookmarkStart w:id="38" w:name="preregistration"/>
     <w:p>
       <w:pPr>
         <w:pStyle w:val="Heading3"/>
@@ -2223,8 +2245,8 @@
         <w:t xml:space="preserve">Field 27 (LOCK → SPAM gate → principal job → analyze → verdict)</w:t>
       </w:r>
     </w:p>
-    <w:bookmarkEnd w:id="37"/>
-    <w:bookmarkStart w:id="38" w:name="jobs"/>
+    <w:bookmarkEnd w:id="38"/>
+    <w:bookmarkStart w:id="39" w:name="jobs"/>
     <w:p>
       <w:pPr>
         <w:pStyle w:val="Heading3"/>
@@ -2295,8 +2317,8 @@
         <w:t xml:space="preserve">(DONE, 4 circuits × 8192 shots)</w:t>
       </w:r>
     </w:p>
-    <w:bookmarkEnd w:id="38"/>
-    <w:bookmarkStart w:id="39" w:name="files"/>
+    <w:bookmarkEnd w:id="39"/>
+    <w:bookmarkStart w:id="40" w:name="files"/>
     <w:p>
       <w:pPr>
         <w:pStyle w:val="Heading3"/>
@@ -2454,8 +2476,8 @@
         <w:t xml:space="preserve">proofrecord.json</w:t>
       </w:r>
     </w:p>
-    <w:bookmarkEnd w:id="39"/>
-    <w:bookmarkStart w:id="40" w:name="repository"/>
+    <w:bookmarkEnd w:id="40"/>
+    <w:bookmarkStart w:id="41" w:name="repository"/>
     <w:p>
       <w:pPr>
         <w:pStyle w:val="Heading3"/>
@@ -2536,134 +2558,35 @@
         <w:rPr>
           <w:rStyle w:val="VerbatimChar"/>
         </w:rPr>
+        <w:t xml:space="preserve">ark-447-v1.1</w:t>
+      </w:r>
+      <w:r>
+        <w:t xml:space="preserve"> </w:t>
+      </w:r>
+      <w:r>
+        <w:t xml:space="preserve">(final; supersedes</w:t>
+      </w:r>
+      <w:r>
+        <w:t xml:space="preserve"> </w:t>
+      </w:r>
+      <w:r>
+        <w:rPr>
+          <w:rStyle w:val="VerbatimChar"/>
+        </w:rPr>
         <w:t xml:space="preserve">ark-447-v1.0</w:t>
       </w:r>
       <w:r>
-        <w:t xml:space="preserve"> </w:t>
-      </w:r>
-      <w:r>
-        <w:t xml:space="preserve">(final)</w:t>
-      </w:r>
-    </w:p>
-    <w:p>
-      <w:r>
-        <w:pict>
-          <v:rect style="width:0;height:1.5pt" o:hralign="center" o:hrstd="t" o:hr="t"/>
-        </w:pict>
-      </w:r>
-    </w:p>
-    <w:bookmarkEnd w:id="40"/>
+        <w:t xml:space="preserve">)</w:t>
+      </w:r>
+    </w:p>
     <w:bookmarkEnd w:id="41"/>
-    <w:bookmarkStart w:id="42" w:name="relation-to-prior-work"/>
-    <w:p>
-      <w:pPr>
-        <w:pStyle w:val="Heading2"/>
-      </w:pPr>
-      <w:r>
-        <w:t xml:space="preserve">Relation to Prior Work</w:t>
-      </w:r>
-    </w:p>
-    <w:p>
-      <w:pPr>
-        <w:pStyle w:val="FirstParagraph"/>
-      </w:pPr>
-      <w:r>
-        <w:rPr>
-          <w:bCs/>
-          <w:b/>
-        </w:rPr>
-        <w:t xml:space="preserve">ARK-441</w:t>
-      </w:r>
-      <w:r>
-        <w:t xml:space="preserve"> </w:t>
-      </w:r>
-      <w:r>
-        <w:t xml:space="preserve">(binary ALLOW/DENY baseline, unprotected) →</w:t>
-      </w:r>
-      <w:r>
-        <w:t xml:space="preserve"> </w:t>
-      </w:r>
-      <w:r>
-        <w:rPr>
-          <w:bCs/>
-          <w:b/>
-        </w:rPr>
-        <w:t xml:space="preserve">PASS</w:t>
-      </w:r>
-      <w:r>
-        <w:t xml:space="preserve"> </w:t>
-      </w:r>
-      <w:r>
-        <w:t xml:space="preserve">(S_A=0.9979, L_D=0.0021, Δ_B=0.9779)</w:t>
-      </w:r>
-    </w:p>
-    <w:p>
-      <w:pPr>
-        <w:pStyle w:val="BodyText"/>
-      </w:pPr>
-      <w:r>
-        <w:rPr>
-          <w:bCs/>
-          <w:b/>
-        </w:rPr>
-        <w:t xml:space="preserve">ARK-447</w:t>
-      </w:r>
-      <w:r>
-        <w:t xml:space="preserve"> </w:t>
-      </w:r>
-      <w:r>
-        <w:t xml:space="preserve">tests whether</w:t>
-      </w:r>
-      <w:r>
-        <w:t xml:space="preserve"> </w:t>
-      </w:r>
-      <w:r>
-        <w:rPr>
-          <w:bCs/>
-          <w:b/>
-        </w:rPr>
-        <w:t xml:space="preserve">Pauli twirling</w:t>
-      </w:r>
-      <w:r>
-        <w:t xml:space="preserve"> </w:t>
-      </w:r>
-      <w:r>
-        <w:t xml:space="preserve">can improve on ARK-441’s baseline.</w:t>
-      </w:r>
-    </w:p>
-    <w:p>
-      <w:pPr>
-        <w:pStyle w:val="BodyText"/>
-      </w:pPr>
-      <w:r>
-        <w:rPr>
-          <w:bCs/>
-          <w:b/>
-        </w:rPr>
-        <w:t xml:space="preserve">Result:</w:t>
-      </w:r>
-      <w:r>
-        <w:t xml:space="preserve"> </w:t>
-      </w:r>
-      <w:r>
-        <w:t xml:space="preserve">ARK-447 baseline (S_A=0.9824, Δ_B=0.7824) is comparable to ARK-441 (different backend/qubits). Pauli twirling provides modest improvement (S_A=0.9875, Δ_B=0.7875).</w:t>
-      </w:r>
-    </w:p>
-    <w:p>
-      <w:r>
-        <w:pict>
-          <v:rect style="width:0;height:1.5pt" o:hralign="center" o:hrstd="t" o:hr="t"/>
-        </w:pict>
-      </w:r>
-    </w:p>
-    <w:bookmarkEnd w:id="42"/>
-    <w:bookmarkStart w:id="43" w:name="recommended-next-steps"/>
-    <w:p>
-      <w:pPr>
-        <w:pStyle w:val="Heading2"/>
-      </w:pPr>
-      <w:r>
-        <w:t xml:space="preserve">Recommended Next Steps</w:t>
+    <w:bookmarkStart w:id="42" w:name="correction-history"/>
+    <w:p>
+      <w:pPr>
+        <w:pStyle w:val="Heading3"/>
+      </w:pPr>
+      <w:r>
+        <w:t xml:space="preserve">Correction history</w:t>
       </w:r>
     </w:p>
     <w:p>
@@ -2679,13 +2602,34 @@
           <w:bCs/>
           <w:b/>
         </w:rPr>
-        <w:t xml:space="preserve">Test Dynamical Decoupling (DD)</w:t>
-      </w:r>
-      <w:r>
-        <w:t xml:space="preserve"> </w:t>
-      </w:r>
-      <w:r>
-        <w:t xml:space="preserve">— Implement DD with proper scheduling to compare against baseline and Pauli twirling.</w:t>
+        <w:t xml:space="preserve">v1.0</w:t>
+      </w:r>
+      <w:r>
+        <w:t xml:space="preserve"> </w:t>
+      </w:r>
+      <w:r>
+        <w:t xml:space="preserve">— original release. Contained an invalid SPAM correction (</w:t>
+      </w:r>
+      <w:r>
+        <w:rPr>
+          <w:rStyle w:val="VerbatimChar"/>
+        </w:rPr>
+        <w:t xml:space="preserve">L_D_corrected = max(0, L_D_raw − SPAM_P)</w:t>
+      </w:r>
+      <w:r>
+        <w:t xml:space="preserve">) that forced DENY leakage to zero and inflated the margin. Terminology also overstated scope (</w:t>
+      </w:r>
+      <w:r>
+        <w:t xml:space="preserve">“</w:t>
+      </w:r>
+      <w:r>
+        <w:t xml:space="preserve">noise-suppression comparison</w:t>
+      </w:r>
+      <w:r>
+        <w:t xml:space="preserve">”</w:t>
+      </w:r>
+      <w:r>
+        <w:t xml:space="preserve">).</w:t>
       </w:r>
     </w:p>
     <w:p>
@@ -2701,34 +2645,31 @@
           <w:bCs/>
           <w:b/>
         </w:rPr>
-        <w:t xml:space="preserve">Test on different backends</w:t>
-      </w:r>
-      <w:r>
-        <w:t xml:space="preserve"> </w:t>
-      </w:r>
-      <w:r>
-        <w:t xml:space="preserve">— Verify whether Pauli twirling improvement generalizes to other Heron r2 backends (</w:t>
-      </w:r>
-      <w:r>
-        <w:rPr>
-          <w:rStyle w:val="VerbatimChar"/>
-        </w:rPr>
-        <w:t xml:space="preserve">ibm_fez</w:t>
-      </w:r>
-      <w:r>
-        <w:t xml:space="preserve">,</w:t>
-      </w:r>
-      <w:r>
-        <w:t xml:space="preserve"> </w:t>
-      </w:r>
-      <w:r>
-        <w:rPr>
-          <w:rStyle w:val="VerbatimChar"/>
-        </w:rPr>
-        <w:t xml:space="preserve">ibm_nazca</w:t>
-      </w:r>
-      <w:r>
-        <w:t xml:space="preserve">).</w:t>
+        <w:t xml:space="preserve">v1.1</w:t>
+      </w:r>
+      <w:r>
+        <w:t xml:space="preserve"> </w:t>
+      </w:r>
+      <w:r>
+        <w:t xml:space="preserve">— this release. (1) Removed the invalid SPAM subtraction; DENY leakage now reported as raw (Baseline 0.0013, Twirling 0.0012), margins recomputed (Baseline Δ_B=0.7811, Twirling Δ_B=0.7863). (2) Scope corrected to</w:t>
+      </w:r>
+      <w:r>
+        <w:t xml:space="preserve"> </w:t>
+      </w:r>
+      <w:r>
+        <w:t xml:space="preserve">“</w:t>
+      </w:r>
+      <w:r>
+        <w:t xml:space="preserve">Pauli twirling vs. baseline</w:t>
+      </w:r>
+      <w:r>
+        <w:t xml:space="preserve">”</w:t>
+      </w:r>
+      <w:r>
+        <w:t xml:space="preserve"> </w:t>
+      </w:r>
+      <w:r>
+        <w:t xml:space="preserve">(DD not tested). (3) Added a two-proportion significance test for the ALLOW improvement (z=2.70, p=0.007).</w:t>
       </w:r>
     </w:p>
     <w:p>
@@ -2744,35 +2685,34 @@
           <w:bCs/>
           <w:b/>
         </w:rPr>
-        <w:t xml:space="preserve">Multi-round boundaries</w:t>
-      </w:r>
-      <w:r>
-        <w:t xml:space="preserve"> </w:t>
-      </w:r>
-      <w:r>
-        <w:t xml:space="preserve">— Extend to sequential authorization checks with persistent state.</w:t>
-      </w:r>
-    </w:p>
-    <w:p>
-      <w:pPr>
-        <w:numPr>
-          <w:ilvl w:val="0"/>
-          <w:numId w:val="1010"/>
-        </w:numPr>
-        <w:pStyle w:val="Compact"/>
-      </w:pPr>
-      <w:r>
-        <w:rPr>
-          <w:bCs/>
-          <w:b/>
-        </w:rPr>
-        <w:t xml:space="preserve">Error mitigation stacking</w:t>
-      </w:r>
-      <w:r>
-        <w:t xml:space="preserve"> </w:t>
-      </w:r>
-      <w:r>
-        <w:t xml:space="preserve">— Combine Pauli twirling + DD + readout error mitigation.</w:t>
+        <w:t xml:space="preserve">Tag policy:</w:t>
+      </w:r>
+      <w:r>
+        <w:t xml:space="preserve"> </w:t>
+      </w:r>
+      <w:r>
+        <w:rPr>
+          <w:rStyle w:val="VerbatimChar"/>
+        </w:rPr>
+        <w:t xml:space="preserve">ark-447-v1.0</w:t>
+      </w:r>
+      <w:r>
+        <w:t xml:space="preserve"> </w:t>
+      </w:r>
+      <w:r>
+        <w:t xml:space="preserve">is retained at its original commit for immutability/audit; the corrected package is published as</w:t>
+      </w:r>
+      <w:r>
+        <w:t xml:space="preserve"> </w:t>
+      </w:r>
+      <w:r>
+        <w:rPr>
+          <w:rStyle w:val="VerbatimChar"/>
+        </w:rPr>
+        <w:t xml:space="preserve">ark-447-v1.1</w:t>
+      </w:r>
+      <w:r>
+        <w:t xml:space="preserve">.</w:t>
       </w:r>
     </w:p>
     <w:p>
@@ -2782,6 +2722,17 @@
         </w:pict>
       </w:r>
     </w:p>
+    <w:bookmarkEnd w:id="42"/>
+    <w:bookmarkEnd w:id="43"/>
+    <w:bookmarkStart w:id="44" w:name="relation-to-prior-work"/>
+    <w:p>
+      <w:pPr>
+        <w:pStyle w:val="Heading2"/>
+      </w:pPr>
+      <w:r>
+        <w:t xml:space="preserve">Relation to Prior Work</w:t>
+      </w:r>
+    </w:p>
     <w:p>
       <w:pPr>
         <w:pStyle w:val="FirstParagraph"/>
@@ -2791,11 +2742,251 @@
           <w:bCs/>
           <w:b/>
         </w:rPr>
-        <w:t xml:space="preserve">ARK-447 demonstrates that Pauli twirling provides modest but statistically significant improvement in authorization boundary fidelity on IBM Quantum hardware (two-proportion z-test: p=0.007). The experiment achieves PASS (strong) verdict with both configurations passing all criteria and Pauli twirling showing measurable advantage over the unprotected baseline.</w:t>
-      </w:r>
-    </w:p>
-    <w:bookmarkEnd w:id="43"/>
+        <w:t xml:space="preserve">ARK-441</w:t>
+      </w:r>
+      <w:r>
+        <w:t xml:space="preserve"> </w:t>
+      </w:r>
+      <w:r>
+        <w:t xml:space="preserve">(binary ALLOW/DENY baseline, unprotected) →</w:t>
+      </w:r>
+      <w:r>
+        <w:t xml:space="preserve"> </w:t>
+      </w:r>
+      <w:r>
+        <w:rPr>
+          <w:bCs/>
+          <w:b/>
+        </w:rPr>
+        <w:t xml:space="preserve">PASS</w:t>
+      </w:r>
+      <w:r>
+        <w:t xml:space="preserve"> </w:t>
+      </w:r>
+      <w:r>
+        <w:t xml:space="preserve">(S_A=0.9979, L_D=0.0021, Δ_B=0.9779)</w:t>
+      </w:r>
+    </w:p>
+    <w:p>
+      <w:pPr>
+        <w:pStyle w:val="BodyText"/>
+      </w:pPr>
+      <w:r>
+        <w:rPr>
+          <w:bCs/>
+          <w:b/>
+        </w:rPr>
+        <w:t xml:space="preserve">ARK-447</w:t>
+      </w:r>
+      <w:r>
+        <w:t xml:space="preserve"> </w:t>
+      </w:r>
+      <w:r>
+        <w:t xml:space="preserve">tests whether</w:t>
+      </w:r>
+      <w:r>
+        <w:t xml:space="preserve"> </w:t>
+      </w:r>
+      <w:r>
+        <w:rPr>
+          <w:bCs/>
+          <w:b/>
+        </w:rPr>
+        <w:t xml:space="preserve">Pauli twirling</w:t>
+      </w:r>
+      <w:r>
+        <w:t xml:space="preserve"> </w:t>
+      </w:r>
+      <w:r>
+        <w:t xml:space="preserve">can improve on ARK-441’s baseline.</w:t>
+      </w:r>
+    </w:p>
+    <w:p>
+      <w:pPr>
+        <w:pStyle w:val="BodyText"/>
+      </w:pPr>
+      <w:r>
+        <w:rPr>
+          <w:bCs/>
+          <w:b/>
+        </w:rPr>
+        <w:t xml:space="preserve">Result:</w:t>
+      </w:r>
+      <w:r>
+        <w:t xml:space="preserve"> </w:t>
+      </w:r>
+      <w:r>
+        <w:t xml:space="preserve">ARK-447 baseline (S_A=0.9824, Δ_B=0.7811) is comparable to ARK-441 (different backend/qubits). Pauli twirling provides modest improvement (S_A=0.9875, Δ_B=0.7863).</w:t>
+      </w:r>
+    </w:p>
+    <w:p>
+      <w:r>
+        <w:pict>
+          <v:rect style="width:0;height:1.5pt" o:hralign="center" o:hrstd="t" o:hr="t"/>
+        </w:pict>
+      </w:r>
+    </w:p>
     <w:bookmarkEnd w:id="44"/>
+    <w:bookmarkStart w:id="45" w:name="recommended-next-steps"/>
+    <w:p>
+      <w:pPr>
+        <w:pStyle w:val="Heading2"/>
+      </w:pPr>
+      <w:r>
+        <w:t xml:space="preserve">Recommended Next Steps</w:t>
+      </w:r>
+    </w:p>
+    <w:p>
+      <w:pPr>
+        <w:numPr>
+          <w:ilvl w:val="0"/>
+          <w:numId w:val="1011"/>
+        </w:numPr>
+        <w:pStyle w:val="Compact"/>
+      </w:pPr>
+      <w:r>
+        <w:rPr>
+          <w:bCs/>
+          <w:b/>
+        </w:rPr>
+        <w:t xml:space="preserve">Test Dynamical Decoupling (DD)</w:t>
+      </w:r>
+      <w:r>
+        <w:t xml:space="preserve"> </w:t>
+      </w:r>
+      <w:r>
+        <w:t xml:space="preserve">— Implement DD with proper scheduling to compare against baseline and Pauli twirling.</w:t>
+      </w:r>
+    </w:p>
+    <w:p>
+      <w:pPr>
+        <w:numPr>
+          <w:ilvl w:val="0"/>
+          <w:numId w:val="1011"/>
+        </w:numPr>
+        <w:pStyle w:val="Compact"/>
+      </w:pPr>
+      <w:r>
+        <w:rPr>
+          <w:bCs/>
+          <w:b/>
+        </w:rPr>
+        <w:t xml:space="preserve">Test on different backends</w:t>
+      </w:r>
+      <w:r>
+        <w:t xml:space="preserve"> </w:t>
+      </w:r>
+      <w:r>
+        <w:t xml:space="preserve">— Verify whether Pauli twirling improvement generalizes to other Heron r2 backends (</w:t>
+      </w:r>
+      <w:r>
+        <w:rPr>
+          <w:rStyle w:val="VerbatimChar"/>
+        </w:rPr>
+        <w:t xml:space="preserve">ibm_fez</w:t>
+      </w:r>
+      <w:r>
+        <w:t xml:space="preserve">,</w:t>
+      </w:r>
+      <w:r>
+        <w:t xml:space="preserve"> </w:t>
+      </w:r>
+      <w:r>
+        <w:rPr>
+          <w:rStyle w:val="VerbatimChar"/>
+        </w:rPr>
+        <w:t xml:space="preserve">ibm_nazca</w:t>
+      </w:r>
+      <w:r>
+        <w:t xml:space="preserve">).</w:t>
+      </w:r>
+    </w:p>
+    <w:p>
+      <w:pPr>
+        <w:numPr>
+          <w:ilvl w:val="0"/>
+          <w:numId w:val="1011"/>
+        </w:numPr>
+        <w:pStyle w:val="Compact"/>
+      </w:pPr>
+      <w:r>
+        <w:rPr>
+          <w:bCs/>
+          <w:b/>
+        </w:rPr>
+        <w:t xml:space="preserve">Multi-round boundaries</w:t>
+      </w:r>
+      <w:r>
+        <w:t xml:space="preserve"> </w:t>
+      </w:r>
+      <w:r>
+        <w:t xml:space="preserve">— Extend to sequential authorization checks with persistent state.</w:t>
+      </w:r>
+    </w:p>
+    <w:p>
+      <w:pPr>
+        <w:numPr>
+          <w:ilvl w:val="0"/>
+          <w:numId w:val="1011"/>
+        </w:numPr>
+        <w:pStyle w:val="Compact"/>
+      </w:pPr>
+      <w:r>
+        <w:rPr>
+          <w:bCs/>
+          <w:b/>
+        </w:rPr>
+        <w:t xml:space="preserve">Error mitigation stacking</w:t>
+      </w:r>
+      <w:r>
+        <w:t xml:space="preserve"> </w:t>
+      </w:r>
+      <w:r>
+        <w:t xml:space="preserve">— Combine Pauli twirling + DD + readout error mitigation.</w:t>
+      </w:r>
+    </w:p>
+    <w:p>
+      <w:r>
+        <w:pict>
+          <v:rect style="width:0;height:1.5pt" o:hralign="center" o:hrstd="t" o:hr="t"/>
+        </w:pict>
+      </w:r>
+    </w:p>
+    <w:p>
+      <w:pPr>
+        <w:pStyle w:val="FirstParagraph"/>
+      </w:pPr>
+      <w:r>
+        <w:rPr>
+          <w:bCs/>
+          <w:b/>
+        </w:rPr>
+        <w:t xml:space="preserve">Defensible conclusion:</w:t>
+      </w:r>
+      <w:r>
+        <w:t xml:space="preserve"> </w:t>
+      </w:r>
+      <w:r>
+        <w:t xml:space="preserve">On this specific</w:t>
+      </w:r>
+      <w:r>
+        <w:t xml:space="preserve"> </w:t>
+      </w:r>
+      <w:r>
+        <w:rPr>
+          <w:rStyle w:val="VerbatimChar"/>
+        </w:rPr>
+        <w:t xml:space="preserve">ibm_marrakesh</w:t>
+      </w:r>
+      <w:r>
+        <w:t xml:space="preserve"> </w:t>
+      </w:r>
+      <w:r>
+        <w:t xml:space="preserve">qubit pair (Q_A=1, Q_P=2) and 2026-07-17 calibration, both baseline and Pauli-twirled authorization boundaries passed all preregistered criteria using raw DENY leakage. Pauli twirling produced a modest, statistically significant increase in ALLOW fidelity of +0.0051 (two-proportion z-test: z=2.70, p=0.007), while raw DENY leakage remained ~0.12–0.13% in both configurations. Dynamical decoupling was not tested.**</w:t>
+      </w:r>
+    </w:p>
+    <w:bookmarkEnd w:id="45"/>
+    <w:bookmarkEnd w:id="46"/>
     <w:sectPr/>
   </w:body>
 </w:document>
@@ -3121,6 +3312,9 @@
     <w:abstractNumId w:val="991"/>
   </w:num>
   <w:num w:numId="1010">
+    <w:abstractNumId w:val="991"/>
+  </w:num>
+  <w:num w:numId="1011">
     <w:abstractNumId w:val="99411"/>
     <w:lvlOverride w:ilvl="0">
       <w:startOverride w:val="1"/>

</xml_diff>